<commit_message>
Clarification sur la question des mocks
</commit_message>
<xml_diff>
--- a/Examen Final Formatif A24.docx
+++ b/Examen Final Formatif A24.docx
@@ -297,49 +297,45 @@
       <w:r>
         <w:t xml:space="preserve">Tests unitaires et </w:t>
       </w:r>
+      <w:r>
+        <w:t>Mock</w:t>
+      </w:r>
+    </w:p>
+    <w:p>
+      <w:pPr>
+        <w:jc w:val="both"/>
+      </w:pPr>
+      <w:r>
+        <w:t>À partir des fichiers de départs</w:t>
+      </w:r>
+      <w:r>
+        <w:t xml:space="preserve"> dan</w:t>
+      </w:r>
+      <w:r>
+        <w:t xml:space="preserve">s le projet </w:t>
+      </w:r>
       <w:proofErr w:type="spellStart"/>
       <w:r>
+        <w:rPr>
+          <w:b/>
+          <w:bCs/>
+        </w:rPr>
+        <w:t>WebAPI</w:t>
+      </w:r>
+      <w:proofErr w:type="spellEnd"/>
+      <w:r>
+        <w:t xml:space="preserve"> de la solution</w:t>
+      </w:r>
+      <w:r>
+        <w:t xml:space="preserve"> </w:t>
+      </w:r>
+      <w:r>
+        <w:rPr>
+          <w:b/>
+          <w:bCs/>
+        </w:rPr>
         <w:t>Mock</w:t>
       </w:r>
-      <w:proofErr w:type="spellEnd"/>
-    </w:p>
-    <w:p>
-      <w:pPr>
-        <w:jc w:val="both"/>
-      </w:pPr>
-      <w:r>
-        <w:t>À partir des fichiers de départs</w:t>
-      </w:r>
-      <w:r>
-        <w:t xml:space="preserve"> dan</w:t>
-      </w:r>
-      <w:r>
-        <w:t xml:space="preserve">s le projet </w:t>
-      </w:r>
-      <w:proofErr w:type="spellStart"/>
-      <w:r>
-        <w:rPr>
-          <w:b/>
-          <w:bCs/>
-        </w:rPr>
-        <w:t>WebAPI</w:t>
-      </w:r>
-      <w:proofErr w:type="spellEnd"/>
-      <w:r>
-        <w:t xml:space="preserve"> de la solution</w:t>
-      </w:r>
-      <w:r>
-        <w:t xml:space="preserve"> </w:t>
-      </w:r>
-      <w:proofErr w:type="spellStart"/>
-      <w:r>
-        <w:rPr>
-          <w:b/>
-          <w:bCs/>
-        </w:rPr>
-        <w:t>Mock</w:t>
-      </w:r>
-      <w:proofErr w:type="spellEnd"/>
       <w:r>
         <w:t>, teste</w:t>
       </w:r>
@@ -418,15 +414,7 @@
         <w:jc w:val="both"/>
       </w:pPr>
       <w:r>
-        <w:t xml:space="preserve">Vous devrez donc utiliser le package </w:t>
-      </w:r>
-      <w:proofErr w:type="spellStart"/>
-      <w:r>
-        <w:t>Nuget</w:t>
-      </w:r>
-      <w:proofErr w:type="spellEnd"/>
-      <w:r>
-        <w:t xml:space="preserve"> </w:t>
+        <w:t xml:space="preserve">Vous devrez donc utiliser le package Nuget </w:t>
       </w:r>
       <w:proofErr w:type="spellStart"/>
       <w:r>
@@ -557,6 +545,9 @@
         </w:numPr>
         <w:spacing w:line="360" w:lineRule="auto"/>
         <w:jc w:val="both"/>
+        <w:rPr>
+          <w:highlight w:val="yellow"/>
+        </w:rPr>
       </w:pPr>
       <w:r>
         <w:t>Dans le cas où le</w:t>
@@ -574,6 +565,69 @@
       </w:r>
       <w:proofErr w:type="spellEnd"/>
       <w:r>
+        <w:t>.</w:t>
+      </w:r>
+      <w:r>
+        <w:t xml:space="preserve"> </w:t>
+      </w:r>
+      <w:r>
+        <w:rPr>
+          <w:highlight w:val="yellow"/>
+        </w:rPr>
+        <w:t>Vérifier que le résultat contient bien la valeur "</w:t>
+      </w:r>
+      <w:proofErr w:type="spellStart"/>
+      <w:r>
+        <w:rPr>
+          <w:highlight w:val="yellow"/>
+        </w:rPr>
+        <w:t>Could</w:t>
+      </w:r>
+      <w:proofErr w:type="spellEnd"/>
+      <w:r>
+        <w:rPr>
+          <w:highlight w:val="yellow"/>
+        </w:rPr>
+        <w:t xml:space="preserve"> not </w:t>
+      </w:r>
+      <w:proofErr w:type="spellStart"/>
+      <w:r>
+        <w:rPr>
+          <w:highlight w:val="yellow"/>
+        </w:rPr>
+        <w:t>find</w:t>
+      </w:r>
+      <w:proofErr w:type="spellEnd"/>
+      <w:r>
+        <w:rPr>
+          <w:highlight w:val="yellow"/>
+        </w:rPr>
+        <w:t xml:space="preserve"> X" où X est </w:t>
+      </w:r>
+      <w:r>
+        <w:rPr>
+          <w:highlight w:val="yellow"/>
+        </w:rPr>
+        <w:t>le</w:t>
+      </w:r>
+      <w:r>
+        <w:rPr>
+          <w:highlight w:val="yellow"/>
+        </w:rPr>
+        <w:t xml:space="preserve"> </w:t>
+      </w:r>
+      <w:proofErr w:type="spellStart"/>
+      <w:r>
+        <w:rPr>
+          <w:highlight w:val="yellow"/>
+        </w:rPr>
+        <w:t>seatNumber</w:t>
+      </w:r>
+      <w:proofErr w:type="spellEnd"/>
+      <w:r>
+        <w:rPr>
+          <w:highlight w:val="yellow"/>
+        </w:rPr>
         <w:t>.</w:t>
       </w:r>
     </w:p>
@@ -1871,17 +1925,8 @@
                 <w:sz w:val="28"/>
                 <w:szCs w:val="28"/>
               </w:rPr>
-              <w:t xml:space="preserve">Question </w:t>
+              <w:t>Question Mock</w:t>
             </w:r>
-            <w:proofErr w:type="spellStart"/>
-            <w:r>
-              <w:rPr>
-                <w:sz w:val="28"/>
-                <w:szCs w:val="28"/>
-              </w:rPr>
-              <w:t>Mock</w:t>
-            </w:r>
-            <w:proofErr w:type="spellEnd"/>
             <w:r>
               <w:rPr>
                 <w:sz w:val="28"/>

</xml_diff>

<commit_message>
Mise à jour des instructions (typos)
</commit_message>
<xml_diff>
--- a/Examen Final Formatif A24.docx
+++ b/Examen Final Formatif A24.docx
@@ -18,6 +18,7 @@
         </w:rPr>
         <w:t xml:space="preserve">Examen </w:t>
       </w:r>
+      <w:proofErr w:type="gramStart"/>
       <w:r>
         <w:rPr>
           <w:lang w:val="fr-CA"/>
@@ -28,7 +29,14 @@
         <w:rPr>
           <w:lang w:val="fr-CA"/>
         </w:rPr>
-        <w:t xml:space="preserve"> - </w:t>
+        <w:t xml:space="preserve"> -</w:t>
+      </w:r>
+      <w:proofErr w:type="gramEnd"/>
+      <w:r>
+        <w:rPr>
+          <w:lang w:val="fr-CA"/>
+        </w:rPr>
+        <w:t xml:space="preserve"> </w:t>
       </w:r>
       <w:r>
         <w:rPr>
@@ -521,7 +529,10 @@
         <w:t>er</w:t>
       </w:r>
       <w:r>
-        <w:t xml:space="preserve"> une place qui est déjà réservée par un autre utilisateur, l’action retourne </w:t>
+        <w:t xml:space="preserve"> une place qui est déjà réservée par un </w:t>
+      </w:r>
+      <w:r>
+        <w:t xml:space="preserve">autre utilisateur, l’action retourne </w:t>
       </w:r>
       <w:proofErr w:type="spellStart"/>
       <w:r>
@@ -545,89 +556,83 @@
         </w:numPr>
         <w:spacing w:line="360" w:lineRule="auto"/>
         <w:jc w:val="both"/>
+      </w:pPr>
+      <w:r>
+        <w:t>Dans le cas où le</w:t>
+      </w:r>
+      <w:r>
+        <w:t xml:space="preserve"> numéro de la place sélectionnée est plus que le maximum (la salle contient 100 places), l’action retourne </w:t>
+      </w:r>
+      <w:proofErr w:type="spellStart"/>
+      <w:r>
+        <w:rPr>
+          <w:b/>
+          <w:bCs/>
+        </w:rPr>
+        <w:t>NotFound</w:t>
+      </w:r>
+      <w:proofErr w:type="spellEnd"/>
+      <w:r>
+        <w:t>.</w:t>
+      </w:r>
+      <w:r>
+        <w:t xml:space="preserve"> </w:t>
+      </w:r>
+      <w:r>
         <w:rPr>
           <w:highlight w:val="yellow"/>
         </w:rPr>
-      </w:pPr>
-      <w:r>
-        <w:t>Dans le cas où le</w:t>
-      </w:r>
-      <w:r>
-        <w:t xml:space="preserve"> numéro de la place sélectionnée est plus que le maximum (la salle contient 100 places), l’action retourne </w:t>
+        <w:t>Vérifier que le résultat contient bien la valeur "</w:t>
       </w:r>
       <w:proofErr w:type="spellStart"/>
       <w:r>
         <w:rPr>
-          <w:b/>
-          <w:bCs/>
-        </w:rPr>
-        <w:t>NotFound</w:t>
+          <w:highlight w:val="yellow"/>
+        </w:rPr>
+        <w:t>Could</w:t>
       </w:r>
       <w:proofErr w:type="spellEnd"/>
       <w:r>
-        <w:t>.</w:t>
-      </w:r>
-      <w:r>
+        <w:rPr>
+          <w:highlight w:val="yellow"/>
+        </w:rPr>
+        <w:t xml:space="preserve"> not </w:t>
+      </w:r>
+      <w:proofErr w:type="spellStart"/>
+      <w:r>
+        <w:rPr>
+          <w:highlight w:val="yellow"/>
+        </w:rPr>
+        <w:t>find</w:t>
+      </w:r>
+      <w:proofErr w:type="spellEnd"/>
+      <w:r>
+        <w:rPr>
+          <w:highlight w:val="yellow"/>
+        </w:rPr>
+        <w:t xml:space="preserve"> X" où X est </w:t>
+      </w:r>
+      <w:r>
+        <w:rPr>
+          <w:highlight w:val="yellow"/>
+        </w:rPr>
+        <w:t>le</w:t>
+      </w:r>
+      <w:r>
+        <w:rPr>
+          <w:highlight w:val="yellow"/>
+        </w:rPr>
         <w:t xml:space="preserve"> </w:t>
       </w:r>
+      <w:proofErr w:type="spellStart"/>
       <w:r>
         <w:rPr>
           <w:highlight w:val="yellow"/>
         </w:rPr>
-        <w:t>Vérifier que le résultat contient bien la valeur "</w:t>
-      </w:r>
-      <w:proofErr w:type="spellStart"/>
-      <w:r>
-        <w:rPr>
-          <w:highlight w:val="yellow"/>
-        </w:rPr>
-        <w:t>Could</w:t>
+        <w:t>seatNumber</w:t>
       </w:r>
       <w:proofErr w:type="spellEnd"/>
       <w:r>
-        <w:rPr>
-          <w:highlight w:val="yellow"/>
-        </w:rPr>
-        <w:t xml:space="preserve"> not </w:t>
-      </w:r>
-      <w:proofErr w:type="spellStart"/>
-      <w:r>
-        <w:rPr>
-          <w:highlight w:val="yellow"/>
-        </w:rPr>
-        <w:t>find</w:t>
-      </w:r>
-      <w:proofErr w:type="spellEnd"/>
-      <w:r>
-        <w:rPr>
-          <w:highlight w:val="yellow"/>
-        </w:rPr>
-        <w:t xml:space="preserve"> X" où X est </w:t>
-      </w:r>
-      <w:r>
-        <w:rPr>
-          <w:highlight w:val="yellow"/>
-        </w:rPr>
-        <w:t>le</w:t>
-      </w:r>
-      <w:r>
-        <w:rPr>
-          <w:highlight w:val="yellow"/>
-        </w:rPr>
-        <w:t xml:space="preserve"> </w:t>
-      </w:r>
-      <w:proofErr w:type="spellStart"/>
-      <w:r>
-        <w:rPr>
-          <w:highlight w:val="yellow"/>
-        </w:rPr>
-        <w:t>seatNumber</w:t>
-      </w:r>
-      <w:proofErr w:type="spellEnd"/>
-      <w:r>
-        <w:rPr>
-          <w:highlight w:val="yellow"/>
-        </w:rPr>
         <w:t>.</w:t>
       </w:r>
     </w:p>
@@ -671,7 +676,7 @@
         <w:t xml:space="preserve">Question </w:t>
       </w:r>
       <w:r>
-        <w:t>3</w:t>
+        <w:t>2</w:t>
       </w:r>
       <w:r>
         <w:t xml:space="preserve"> – </w:t>
@@ -1073,15 +1078,40 @@
     </w:p>
     <w:p>
       <w:pPr>
+        <w:rPr>
+          <w:rFonts w:asciiTheme="majorHAnsi" w:eastAsiaTheme="majorEastAsia" w:hAnsiTheme="majorHAnsi" w:cstheme="majorBidi"/>
+          <w:color w:val="2F5496" w:themeColor="accent1" w:themeShade="BF"/>
+          <w:sz w:val="32"/>
+          <w:szCs w:val="32"/>
+        </w:rPr>
+      </w:pPr>
+    </w:p>
+    <w:p>
+      <w:pPr>
+        <w:rPr>
+          <w:rFonts w:asciiTheme="majorHAnsi" w:eastAsiaTheme="majorEastAsia" w:hAnsiTheme="majorHAnsi" w:cstheme="majorBidi"/>
+          <w:color w:val="2F5496" w:themeColor="accent1" w:themeShade="BF"/>
+          <w:sz w:val="32"/>
+          <w:szCs w:val="32"/>
+        </w:rPr>
+      </w:pPr>
+      <w:r>
+        <w:br w:type="page"/>
+      </w:r>
+    </w:p>
+    <w:p>
+      <w:pPr>
         <w:pStyle w:val="Titre1"/>
       </w:pPr>
-    </w:p>
-    <w:p>
-      <w:pPr>
-        <w:pStyle w:val="Titre1"/>
-      </w:pPr>
-      <w:r>
-        <w:t xml:space="preserve">Question 2 – </w:t>
+      <w:r>
+        <w:lastRenderedPageBreak/>
+        <w:t xml:space="preserve">Question </w:t>
+      </w:r>
+      <w:r>
+        <w:t>3</w:t>
+      </w:r>
+      <w:r>
+        <w:t xml:space="preserve"> – </w:t>
       </w:r>
       <w:proofErr w:type="spellStart"/>
       <w:r>
@@ -1121,7 +1151,10 @@
         <w:t>e</w:t>
       </w:r>
       <w:r>
-        <w:t xml:space="preserve"> authentification par Cookie</w:t>
+        <w:t xml:space="preserve"> authentification </w:t>
+      </w:r>
+      <w:r>
+        <w:t>fonctionnelle</w:t>
       </w:r>
       <w:r>
         <w:t>.</w:t>
@@ -1262,7 +1295,6 @@
         <w:rPr>
           <w:noProof/>
         </w:rPr>
-        <w:lastRenderedPageBreak/>
         <w:drawing>
           <wp:inline distT="0" distB="0" distL="0" distR="0" wp14:anchorId="7601FFA0" wp14:editId="76970A8A">
             <wp:extent cx="3065452" cy="2295525"/>
@@ -1385,6 +1417,7 @@
         <w:jc w:val="both"/>
       </w:pPr>
       <w:r>
+        <w:lastRenderedPageBreak/>
         <w:t>Il existe déjà une méthode</w:t>
       </w:r>
       <w:r>
@@ -1590,7 +1623,6 @@
           <w:noProof/>
           <w:lang w:val="fr-CA"/>
         </w:rPr>
-        <w:lastRenderedPageBreak/>
         <w:drawing>
           <wp:inline distT="0" distB="0" distL="0" distR="0" wp14:anchorId="256AF967" wp14:editId="13EE9918">
             <wp:extent cx="2345838" cy="685165"/>
@@ -1988,7 +2020,7 @@
               <w:jc w:val="center"/>
             </w:pPr>
             <w:r>
-              <w:t>2</w:t>
+              <w:t>1</w:t>
             </w:r>
           </w:p>
         </w:tc>
@@ -2016,7 +2048,7 @@
               <w:jc w:val="center"/>
             </w:pPr>
             <w:r>
-              <w:t>1</w:t>
+              <w:t>2</w:t>
             </w:r>
           </w:p>
         </w:tc>

</xml_diff>